<commit_message>
Add Section 8 LLM and GEO preparation to Word docx and report
</commit_message>
<xml_diff>
--- a/public/INFORME_TECNICO_Y_COMERCIAL_ESTUDIO_PERICIAL_SUR.docx
+++ b/public/INFORME_TECNICO_Y_COMERCIAL_ESTUDIO_PERICIAL_SUR.docx
@@ -30,9 +30,9 @@
         <w:rPr>
           <w:rFonts w:ascii="Arial" w:hAnsi="Arial"/>
           <w:color w:val="505050"/>
-          <w:sz w:val="22"/>
+          <w:sz w:val="21"/>
         </w:rPr>
-        <w:t>Auditoría SSL, Rendimiento PageSpeed, Dominios, Competidores y Plan de Captación</w:t>
+        <w:t>Auditoría SSL, Rendimiento PageSpeed, Dominios, Competidores, Plan de Captación y Preparación para IA / LLMs</w:t>
       </w:r>
     </w:p>
     <w:p/>
@@ -252,7 +252,7 @@
           <w:color w:val="1E1E1E"/>
           <w:sz w:val="20"/>
         </w:rPr>
-        <w:t>El presente informe constituye la auditoría técnica integral, análisis de rendimiento, seguridad SSL, benchmark de competidores y el plan maestro de adquisición orgánica (SEO) para Estudio Pericial Sur.</w:t>
+        <w:t>El presente informe constituye la auditoría técnica integral, análisis de rendimiento, seguridad SSL, benchmark de competidores, plan de adquisición orgánica (SEO) y la estrategia de optimización para motores de Inteligencia Artificial (GEO / AEO) para Estudio Pericial Sur.</w:t>
       </w:r>
     </w:p>
     <w:p>
@@ -5404,7 +5404,118 @@
           <w:color w:val="152836"/>
           <w:sz w:val="26"/>
         </w:rPr>
-        <w:t>8. Plan de Acción y Conclusión</w:t>
+        <w:t>8. Preparación para Motores de Inteligencia Artificial (GEO / AEO &amp; LLMs)</w:t>
+      </w:r>
+    </w:p>
+    <w:p>
+      <w:pPr>
+        <w:spacing w:after="80" w:line="276" w:lineRule="auto"/>
+      </w:pPr>
+      <w:r>
+        <w:rPr>
+          <w:i w:val="0"/>
+          <w:color w:val="1E1E1E"/>
+          <w:sz w:val="20"/>
+        </w:rPr>
+        <w:t>El sitio web de Estudio Pericial Sur fue construido siguiendo los estándares de AEO (Answer Engine Optimization) y GEO (Generative Engine Optimization) para asegurar que los motores de IA (ChatGPT Search, Perplexity AI, Google Gemini y Claude) recomienden al estudio:</w:t>
+      </w:r>
+    </w:p>
+    <w:p>
+      <w:pPr>
+        <w:pStyle w:val="ListBullet"/>
+        <w:spacing w:after="60" w:line="276" w:lineRule="auto"/>
+      </w:pPr>
+      <w:r>
+        <w:rPr>
+          <w:b/>
+          <w:color w:val="152836"/>
+          <w:sz w:val="19"/>
+        </w:rPr>
+        <w:t xml:space="preserve">Protocolo llms.txt Activo: </w:t>
+      </w:r>
+      <w:r>
+        <w:rPr>
+          <w:color w:val="1E1E1E"/>
+          <w:sz w:val="19"/>
+        </w:rPr>
+        <w:t>Implementado en https://pericias.tecnobrain.ar/llms.txt. Permite que los rastreadores de IA lean en texto puro los servicios, credenciales (UBA 2016/2017), matrículas y datos de contacto.</w:t>
+      </w:r>
+    </w:p>
+    <w:p>
+      <w:pPr>
+        <w:pStyle w:val="ListBullet"/>
+        <w:spacing w:after="60" w:line="276" w:lineRule="auto"/>
+      </w:pPr>
+      <w:r>
+        <w:rPr>
+          <w:b/>
+          <w:color w:val="152836"/>
+          <w:sz w:val="19"/>
+        </w:rPr>
+        <w:t xml:space="preserve">Grafo de Entidades Schema.org: </w:t>
+      </w:r>
+      <w:r>
+        <w:rPr>
+          <w:color w:val="1E1E1E"/>
+          <w:sz w:val="19"/>
+        </w:rPr>
+        <w:t>Identificación semántica de las profesionales con afiliación universitaria (alumniOf UBA) y matrículas judiciales (PJN y SCBA), alimentando los grafos de conocimiento de ChatGPT y Google.</w:t>
+      </w:r>
+    </w:p>
+    <w:p>
+      <w:pPr>
+        <w:pStyle w:val="ListBullet"/>
+        <w:spacing w:after="60" w:line="276" w:lineRule="auto"/>
+      </w:pPr>
+      <w:r>
+        <w:rPr>
+          <w:b/>
+          <w:color w:val="152836"/>
+          <w:sz w:val="19"/>
+        </w:rPr>
+        <w:t xml:space="preserve">Formato de Respuestas Directas (AEO): </w:t>
+      </w:r>
+      <w:r>
+        <w:rPr>
+          <w:color w:val="1E1E1E"/>
+          <w:sz w:val="19"/>
+        </w:rPr>
+        <w:t>Bloques de FAQs estructurados con respuestas concisas de 40 a 60 palabras, diseñados para ser citados como fragmentos destacados en Google AI Overviews.</w:t>
+      </w:r>
+    </w:p>
+    <w:p>
+      <w:pPr>
+        <w:pStyle w:val="ListBullet"/>
+        <w:spacing w:after="60" w:line="276" w:lineRule="auto"/>
+      </w:pPr>
+      <w:r>
+        <w:rPr>
+          <w:b/>
+          <w:color w:val="152836"/>
+          <w:sz w:val="19"/>
+        </w:rPr>
+        <w:t xml:space="preserve">Cero Lag de Renderizado (SSR): </w:t>
+      </w:r>
+      <w:r>
+        <w:rPr>
+          <w:color w:val="1E1E1E"/>
+          <w:sz w:val="19"/>
+        </w:rPr>
+        <w:t>Los crawlers de IA (GPTBot, PerplexityBot) no ejecutan código JavaScript complejo. Al ser HTML nativo en PHP, el 100% del contenido es absorbido al instante.</w:t>
+      </w:r>
+    </w:p>
+    <w:p>
+      <w:pPr>
+        <w:spacing w:before="320" w:after="120"/>
+      </w:pPr>
+      <w:r>
+        <w:rPr>
+          <w:rFonts w:ascii="Arial" w:hAnsi="Arial"/>
+          <w:b/>
+          <w:color w:val="152836"/>
+          <w:sz w:val="26"/>
+        </w:rPr>
+        <w:t>9. Plan de Acción y Conclusión</w:t>
       </w:r>
     </w:p>
     <w:p>

</xml_diff>

<commit_message>
Add Section 10 Instagram Content Strategy and Video Scripts to Word docx and report
</commit_message>
<xml_diff>
--- a/public/INFORME_TECNICO_Y_COMERCIAL_ESTUDIO_PERICIAL_SUR.docx
+++ b/public/INFORME_TECNICO_Y_COMERCIAL_ESTUDIO_PERICIAL_SUR.docx
@@ -21,9 +21,9 @@
           <w:rFonts w:ascii="Arial" w:hAnsi="Arial"/>
           <w:b/>
           <w:color w:val="152836"/>
-          <w:sz w:val="36"/>
+          <w:sz w:val="34"/>
         </w:rPr>
-        <w:t>INFORME TÉCNICO, COMERCIAL Y ESTRATEGIA SEO</w:t>
+        <w:t>INFORME TÉCNICO, COMERCIAL, ESTRATEGIA SEO Y GUÍA DE CONTENIDOS PARA REDES SOCIALES</w:t>
         <w:br/>
       </w:r>
       <w:r>
@@ -32,7 +32,7 @@
           <w:color w:val="505050"/>
           <w:sz w:val="21"/>
         </w:rPr>
-        <w:t>Auditoría SSL, Rendimiento PageSpeed, Dominios, Competidores, Plan de Captación y Preparación para IA / LLMs</w:t>
+        <w:t>Auditoría Web, PageSpeed, Dominios, Competidores, SEO/GEO y Guiones Estratégicos de Captación para Instagram / TikTok</w:t>
       </w:r>
     </w:p>
     <w:p/>
@@ -221,7 +221,7 @@
                 <w:color w:val="1E1E1E"/>
                 <w:sz w:val="19"/>
               </w:rPr>
-              <w:t>Equipo de Ingeniería Web &amp; Estrategia SEO</w:t>
+              <w:t>Equipo de Ingeniería Web &amp; Estrategia SEO / Contenidos</w:t>
             </w:r>
           </w:p>
         </w:tc>
@@ -250,9 +250,9 @@
         <w:rPr>
           <w:i w:val="0"/>
           <w:color w:val="1E1E1E"/>
-          <w:sz w:val="20"/>
+          <w:sz w:val="19"/>
         </w:rPr>
-        <w:t>El presente informe constituye la auditoría técnica integral, análisis de rendimiento, seguridad SSL, benchmark de competidores, plan de adquisición orgánica (SEO) y la estrategia de optimización para motores de Inteligencia Artificial (GEO / AEO) para Estudio Pericial Sur.</w:t>
+        <w:t>El presente informe constituye la auditoría técnica integral, análisis de rendimiento, seguridad SSL, benchmark de competidores, plan de adquisición orgánica (SEO), optimización para Inteligencia Artificial (GEO/AEO) y la guía estratégica de guiones y contenidos para redes sociales de Estudio Pericial Sur.</w:t>
       </w:r>
     </w:p>
     <w:p>
@@ -263,7 +263,7 @@
         <w:rPr>
           <w:i w:val="0"/>
           <w:color w:val="1E1E1E"/>
-          <w:sz w:val="20"/>
+          <w:sz w:val="19"/>
         </w:rPr>
         <w:t>El sitio se encuentra actualmente publicado y 100% operativo en el servidor de producción con un rendimiento de carga instantáneo (TTFB &lt; 22 ms), arquitectura semántica de URLs sin bases de datos pesadas, y datos estructurados JSON-LD validados.</w:t>
       </w:r>
@@ -290,7 +290,7 @@
         <w:rPr>
           <w:i w:val="0"/>
           <w:color w:val="1E1E1E"/>
-          <w:sz w:val="20"/>
+          <w:sz w:val="19"/>
         </w:rPr>
         <w:t>Se realizó un escaneo criptográfico y de cabeceras de red sobre el dominio pericias.tecnobrain.ar:</w:t>
       </w:r>
@@ -869,7 +869,7 @@
         <w:rPr>
           <w:i w:val="0"/>
           <w:color w:val="1E1E1E"/>
-          <w:sz w:val="20"/>
+          <w:sz w:val="19"/>
         </w:rPr>
         <w:t>A diferencia de plataformas en WordPress con constructores pesados (Elementor/Divi) que demoran entre 3.000 y 6.000 ms en responder, la plataforma de Estudio Pericial Sur fue desarrollada en PHP Modular Ultraligero con Vanilla CSS:</w:t>
       </w:r>
@@ -1621,7 +1621,7 @@
         <w:rPr>
           <w:i w:val="0"/>
           <w:color w:val="1E1E1E"/>
-          <w:sz w:val="20"/>
+          <w:sz w:val="19"/>
         </w:rPr>
         <w:t>Se verificó el estado en los registros oficiales de NIC.ar y RDAP/Whois para el pase a producción definitiva:</w:t>
       </w:r>
@@ -2316,7 +2316,7 @@
         <w:rPr>
           <w:b/>
           <w:color w:val="1E1E1E"/>
-          <w:sz w:val="20"/>
+          <w:sz w:val="19"/>
         </w:rPr>
         <w:t xml:space="preserve">Recomendación: </w:t>
       </w:r>
@@ -2324,7 +2324,7 @@
         <w:rPr>
           <w:i w:val="0"/>
           <w:color w:val="1E1E1E"/>
-          <w:sz w:val="20"/>
+          <w:sz w:val="19"/>
         </w:rPr>
         <w:t>Recomendación Directa: Registrar el combo estudiopericialsur.com.ar (en NIC.ar a costo oficial) y estudiopericialsur.com (en Namecheap/Cloudflare), configurando el .com con redirección 301 al .com.ar.</w:t>
       </w:r>
@@ -2351,7 +2351,7 @@
         <w:rPr>
           <w:i w:val="0"/>
           <w:color w:val="1E1E1E"/>
-          <w:sz w:val="20"/>
+          <w:sz w:val="19"/>
         </w:rPr>
         <w:t>Se relevaron los 10 principales competidores en los resultados de búsqueda de Argentina:</w:t>
       </w:r>
@@ -3600,7 +3600,7 @@
         <w:rPr>
           <w:i w:val="0"/>
           <w:color w:val="1E1E1E"/>
-          <w:sz w:val="20"/>
+          <w:sz w:val="19"/>
         </w:rPr>
         <w:t>Esta sección analiza qué busca la gente en Google Argentina y dónde está la mayor oportunidad comercial para conseguir clientes. A continuación se explica en detalle qué significa cada columna:</w:t>
       </w:r>
@@ -4912,7 +4912,7 @@
         <w:rPr>
           <w:i w:val="0"/>
           <w:color w:val="1E1E1E"/>
-          <w:sz w:val="20"/>
+          <w:sz w:val="19"/>
         </w:rPr>
         <w:t>Frases de búsqueda con alta tasa de conversión directa para estructurar los próximos artículos y contenidos:</w:t>
       </w:r>
@@ -5415,7 +5415,7 @@
         <w:rPr>
           <w:i w:val="0"/>
           <w:color w:val="1E1E1E"/>
-          <w:sz w:val="20"/>
+          <w:sz w:val="19"/>
         </w:rPr>
         <w:t>El sitio web de Estudio Pericial Sur fue construido siguiendo los estándares de AEO (Answer Engine Optimization) y GEO (Generative Engine Optimization) para asegurar que los motores de IA (ChatGPT Search, Perplexity AI, Google Gemini y Claude) recomienden al estudio:</w:t>
       </w:r>
@@ -5515,7 +5515,1307 @@
           <w:color w:val="152836"/>
           <w:sz w:val="26"/>
         </w:rPr>
-        <w:t>9. Plan de Acción y Conclusión</w:t>
+        <w:t>9. Guía Estratégica de Contenidos &amp; Guiones para Instagram / TikTok</w:t>
+      </w:r>
+    </w:p>
+    <w:p>
+      <w:pPr>
+        <w:spacing w:after="80" w:line="276" w:lineRule="auto"/>
+      </w:pPr>
+      <w:r>
+        <w:rPr>
+          <w:i w:val="0"/>
+          <w:color w:val="1E1E1E"/>
+          <w:sz w:val="19"/>
+        </w:rPr>
+        <w:t>Para transformar el perfil de Instagram (@estudiopericial.sur) en un canal de captación constante de clientes y abogados, se definen los 3 públicos objetivos, el tono de comunicación y 5 guiones estructurados listos para grabar:</w:t>
+      </w:r>
+    </w:p>
+    <w:p>
+      <w:pPr>
+        <w:spacing w:before="240" w:after="80"/>
+      </w:pPr>
+      <w:r>
+        <w:rPr>
+          <w:rFonts w:ascii="Arial" w:hAnsi="Arial"/>
+          <w:b/>
+          <w:color w:val="1A7A6C"/>
+          <w:sz w:val="22"/>
+        </w:rPr>
+        <w:t>Definición de Públicos Objetivos (Buyer Personas)</w:t>
+      </w:r>
+    </w:p>
+    <w:p>
+      <w:pPr>
+        <w:pStyle w:val="ListBullet"/>
+        <w:spacing w:after="60" w:line="276" w:lineRule="auto"/>
+      </w:pPr>
+      <w:r>
+        <w:rPr>
+          <w:b/>
+          <w:color w:val="152836"/>
+          <w:sz w:val="19"/>
+        </w:rPr>
+        <w:t xml:space="preserve">Público 1: Abogados Litigantes &amp; Estudios Jurídicos (B2B): </w:t>
+      </w:r>
+      <w:r>
+        <w:rPr>
+          <w:color w:val="1E1E1E"/>
+          <w:sz w:val="19"/>
+        </w:rPr>
+        <w:t>Letrados de fueros Laboral, Civil y Familia. Necesitan auxilio pericial sólido, redacción técnica de puntos de pericia e impugnaciones procesales fundamentadas en baremos oficiales dentro del plazo de 5 días. Lenguaje técnico, preciso y procesal.</w:t>
+      </w:r>
+    </w:p>
+    <w:p>
+      <w:pPr>
+        <w:pStyle w:val="ListBullet"/>
+        <w:spacing w:after="60" w:line="276" w:lineRule="auto"/>
+      </w:pPr>
+      <w:r>
+        <w:rPr>
+          <w:b/>
+          <w:color w:val="152836"/>
+          <w:sz w:val="19"/>
+        </w:rPr>
+        <w:t xml:space="preserve">Público 2: Particulares en Juicios o Demandas (B2C): </w:t>
+      </w:r>
+      <w:r>
+        <w:rPr>
+          <w:color w:val="1E1E1E"/>
+          <w:sz w:val="19"/>
+        </w:rPr>
+        <w:t>Personas que sufrieron un accidente de tránsito, despido discriminatorio, acoso laboral (mobbing) o transitan un divorcio conflictivo. Buscan saber si pueden reclamar daño psíquico. Lenguaje empático, pedagógico, claro y cercano.</w:t>
+      </w:r>
+    </w:p>
+    <w:p>
+      <w:pPr>
+        <w:pStyle w:val="ListBullet"/>
+        <w:spacing w:after="60" w:line="276" w:lineRule="auto"/>
+      </w:pPr>
+      <w:r>
+        <w:rPr>
+          <w:b/>
+          <w:color w:val="152836"/>
+          <w:sz w:val="19"/>
+        </w:rPr>
+        <w:t xml:space="preserve">Público 3: Personas que precisan Aptos y Psicotécnicos: </w:t>
+      </w:r>
+      <w:r>
+        <w:rPr>
+          <w:color w:val="1E1E1E"/>
+          <w:sz w:val="19"/>
+        </w:rPr>
+        <w:t>Docentes en ingreso a la provincia, solicitantes de portación ANMaC, postulantes laborales o cirugías. Buscan agilidad, turnos rápidos y entrega de informe oficial en 48 hs.</w:t>
+      </w:r>
+    </w:p>
+    <w:p>
+      <w:pPr>
+        <w:spacing w:before="240" w:after="80"/>
+      </w:pPr>
+      <w:r>
+        <w:rPr>
+          <w:rFonts w:ascii="Arial" w:hAnsi="Arial"/>
+          <w:b/>
+          <w:color w:val="1A7A6C"/>
+          <w:sz w:val="22"/>
+        </w:rPr>
+        <w:t>Estructura Ganadora de un Reel / Video de Captación</w:t>
+      </w:r>
+    </w:p>
+    <w:p>
+      <w:pPr>
+        <w:spacing w:after="80" w:line="276" w:lineRule="auto"/>
+      </w:pPr>
+      <w:r>
+        <w:rPr>
+          <w:i/>
+          <w:color w:val="1E1E1E"/>
+          <w:sz w:val="19"/>
+        </w:rPr>
+        <w:t>Todo video de alto impacto debe seguir esta fórmula de 4 pasos:</w:t>
+      </w:r>
+    </w:p>
+    <w:p>
+      <w:pPr>
+        <w:pStyle w:val="ListBullet"/>
+        <w:spacing w:after="60" w:line="276" w:lineRule="auto"/>
+      </w:pPr>
+      <w:r>
+        <w:rPr>
+          <w:b/>
+          <w:color w:val="152836"/>
+          <w:sz w:val="19"/>
+        </w:rPr>
+        <w:t xml:space="preserve">1. Gancho Visual y Verbal (0 a 3 seg): </w:t>
+      </w:r>
+      <w:r>
+        <w:rPr>
+          <w:color w:val="1E1E1E"/>
+          <w:sz w:val="19"/>
+        </w:rPr>
+        <w:t>Pregunta provocadora o dolor concreto que frena el scroll del usuario.</w:t>
+      </w:r>
+    </w:p>
+    <w:p>
+      <w:pPr>
+        <w:pStyle w:val="ListBullet"/>
+        <w:spacing w:after="60" w:line="276" w:lineRule="auto"/>
+      </w:pPr>
+      <w:r>
+        <w:rPr>
+          <w:b/>
+          <w:color w:val="152836"/>
+          <w:sz w:val="19"/>
+        </w:rPr>
+        <w:t xml:space="preserve">2. Exposición del Problema (4 a 12 seg): </w:t>
+      </w:r>
+      <w:r>
+        <w:rPr>
+          <w:color w:val="1E1E1E"/>
+          <w:sz w:val="19"/>
+        </w:rPr>
+        <w:t>Contextualización rápida de la trampa procesal o angustia del cliente.</w:t>
+      </w:r>
+    </w:p>
+    <w:p>
+      <w:pPr>
+        <w:pStyle w:val="ListBullet"/>
+        <w:spacing w:after="60" w:line="276" w:lineRule="auto"/>
+      </w:pPr>
+      <w:r>
+        <w:rPr>
+          <w:b/>
+          <w:color w:val="152836"/>
+          <w:sz w:val="19"/>
+        </w:rPr>
+        <w:t xml:space="preserve">3. Solución Técnica Demostrada (13 a 35 seg): </w:t>
+      </w:r>
+      <w:r>
+        <w:rPr>
+          <w:color w:val="1E1E1E"/>
+          <w:sz w:val="19"/>
+        </w:rPr>
+        <w:t>Explicación del criterio pericial/clínico (Castex-Silva, batería de tests, plazos).</w:t>
+      </w:r>
+    </w:p>
+    <w:p>
+      <w:pPr>
+        <w:pStyle w:val="ListBullet"/>
+        <w:spacing w:after="60" w:line="276" w:lineRule="auto"/>
+      </w:pPr>
+      <w:r>
+        <w:rPr>
+          <w:b/>
+          <w:color w:val="152836"/>
+          <w:sz w:val="19"/>
+        </w:rPr>
+        <w:t xml:space="preserve">4. Llamado a la Acción Claro (36 a 45 seg): </w:t>
+      </w:r>
+      <w:r>
+        <w:rPr>
+          <w:color w:val="1E1E1E"/>
+          <w:sz w:val="19"/>
+        </w:rPr>
+        <w:t>Instrucción directa: "Escribinos por mensaje directo o al link de nuestra bio para evaluar tu caso".</w:t>
+      </w:r>
+    </w:p>
+    <w:tbl>
+      <w:tblPr>
+        <w:tblW w:type="auto" w:w="0"/>
+        <w:jc w:val="center"/>
+        <w:tblLook w:firstColumn="1" w:firstRow="1" w:lastColumn="0" w:lastRow="0" w:noHBand="0" w:noVBand="1" w:val="04A0"/>
+      </w:tblPr>
+      <w:tblGrid>
+        <w:gridCol w:w="5040"/>
+        <w:gridCol w:w="5040"/>
+      </w:tblGrid>
+      <w:tr>
+        <w:tc>
+          <w:tcPr>
+            <w:tcW w:type="dxa" w:w="7200"/>
+            <w:gridSpan w:val="2"/>
+            <w:shd w:fill="1A7A6C"/>
+            <w:tcMar>
+              <w:top w:w="80" w:type="dxa"/>
+              <w:bottom w:w="80" w:type="dxa"/>
+              <w:left w:w="100" w:type="dxa"/>
+              <w:right w:w="100" w:type="dxa"/>
+            </w:tcMar>
+          </w:tcPr>
+          <w:p>
+            <w:r>
+              <w:rPr>
+                <w:b/>
+                <w:color w:val="FFFFFF"/>
+                <w:sz w:val="20"/>
+              </w:rPr>
+              <w:t>🎬 GUION REEL / VIDEO: PARA ABOGADOS: IMPUGNACIÓN DE PERICIA EN 5 DÍAS</w:t>
+            </w:r>
+          </w:p>
+        </w:tc>
+      </w:tr>
+      <w:tr>
+        <w:tc>
+          <w:tcPr>
+            <w:tcW w:type="dxa" w:w="2880"/>
+            <w:shd w:fill="F4F6F8"/>
+            <w:tcMar>
+              <w:top w:w="60" w:type="dxa"/>
+              <w:bottom w:w="60" w:type="dxa"/>
+              <w:left w:w="80" w:type="dxa"/>
+              <w:right w:w="80" w:type="dxa"/>
+            </w:tcMar>
+          </w:tcPr>
+          <w:p>
+            <w:r>
+              <w:rPr>
+                <w:b/>
+                <w:color w:val="152836"/>
+                <w:sz w:val="17"/>
+              </w:rPr>
+              <w:t>Público &amp; Objetivo:</w:t>
+            </w:r>
+          </w:p>
+        </w:tc>
+        <w:tc>
+          <w:tcPr>
+            <w:tcW w:type="dxa" w:w="7200"/>
+            <w:shd w:fill="FFFFFF"/>
+            <w:tcMar>
+              <w:top w:w="60" w:type="dxa"/>
+              <w:bottom w:w="60" w:type="dxa"/>
+              <w:left w:w="80" w:type="dxa"/>
+              <w:right w:w="80" w:type="dxa"/>
+            </w:tcMar>
+          </w:tcPr>
+          <w:p>
+            <w:r>
+              <w:rPr>
+                <w:color w:val="1E1E1E"/>
+                <w:sz w:val="17"/>
+              </w:rPr>
+              <w:t>Abogados laboralistas y civilistas | Captar letrados con pericias oficiales desfavorables.</w:t>
+            </w:r>
+          </w:p>
+        </w:tc>
+      </w:tr>
+      <w:tr>
+        <w:tc>
+          <w:tcPr>
+            <w:tcW w:type="dxa" w:w="2880"/>
+            <w:shd w:fill="F4F6F8"/>
+            <w:tcMar>
+              <w:top w:w="60" w:type="dxa"/>
+              <w:bottom w:w="60" w:type="dxa"/>
+              <w:left w:w="80" w:type="dxa"/>
+              <w:right w:w="80" w:type="dxa"/>
+            </w:tcMar>
+          </w:tcPr>
+          <w:p>
+            <w:r>
+              <w:rPr>
+                <w:b/>
+                <w:color w:val="152836"/>
+                <w:sz w:val="17"/>
+              </w:rPr>
+              <w:t>Gancho (Primeros 3 seg):</w:t>
+            </w:r>
+          </w:p>
+        </w:tc>
+        <w:tc>
+          <w:tcPr>
+            <w:tcW w:type="dxa" w:w="7200"/>
+            <w:shd w:fill="FFFFFF"/>
+            <w:tcMar>
+              <w:top w:w="60" w:type="dxa"/>
+              <w:bottom w:w="60" w:type="dxa"/>
+              <w:left w:w="80" w:type="dxa"/>
+              <w:right w:w="80" w:type="dxa"/>
+            </w:tcMar>
+          </w:tcPr>
+          <w:p>
+            <w:r>
+              <w:rPr>
+                <w:color w:val="1E1E1E"/>
+                <w:sz w:val="17"/>
+              </w:rPr>
+              <w:t>¿Te notificaron una pericia psicológica de oficio que no cuantificó el daño psíquico o fijó un 0% injustificado? Tenés solo 5 días para impugnarla.</w:t>
+            </w:r>
+          </w:p>
+        </w:tc>
+      </w:tr>
+      <w:tr>
+        <w:tc>
+          <w:tcPr>
+            <w:tcW w:type="dxa" w:w="2880"/>
+            <w:shd w:fill="F4F6F8"/>
+            <w:tcMar>
+              <w:top w:w="60" w:type="dxa"/>
+              <w:bottom w:w="60" w:type="dxa"/>
+              <w:left w:w="80" w:type="dxa"/>
+              <w:right w:w="80" w:type="dxa"/>
+            </w:tcMar>
+          </w:tcPr>
+          <w:p>
+            <w:r>
+              <w:rPr>
+                <w:b/>
+                <w:color w:val="152836"/>
+                <w:sz w:val="17"/>
+              </w:rPr>
+              <w:t>Desarrollo (15-30 seg):</w:t>
+            </w:r>
+          </w:p>
+        </w:tc>
+        <w:tc>
+          <w:tcPr>
+            <w:tcW w:type="dxa" w:w="7200"/>
+            <w:shd w:fill="FFFFFF"/>
+            <w:tcMar>
+              <w:top w:w="60" w:type="dxa"/>
+              <w:bottom w:w="60" w:type="dxa"/>
+              <w:left w:w="80" w:type="dxa"/>
+              <w:right w:w="80" w:type="dxa"/>
+            </w:tcMar>
+          </w:tcPr>
+          <w:p>
+            <w:r>
+              <w:rPr>
+                <w:color w:val="1E1E1E"/>
+                <w:sz w:val="17"/>
+              </w:rPr>
+              <w:t>El error más común en los peritajes de oficio es confundir daño psíquico con daño moral o utilizar entrevistas aisladas sin una batería proyectiva completa (Bender, Rorschach, MMPI-2). Como consultoras técnicas, analizamos las fallas metodológicas del dictamen, contrastamos con el baremo Castex-Silva y redactamos la impugnación fundada con rigor científico para defender la indemnización de tu cliente.</w:t>
+            </w:r>
+          </w:p>
+        </w:tc>
+      </w:tr>
+      <w:tr>
+        <w:tc>
+          <w:tcPr>
+            <w:tcW w:type="dxa" w:w="2880"/>
+            <w:shd w:fill="F4F6F8"/>
+            <w:tcMar>
+              <w:top w:w="60" w:type="dxa"/>
+              <w:bottom w:w="60" w:type="dxa"/>
+              <w:left w:w="80" w:type="dxa"/>
+              <w:right w:w="80" w:type="dxa"/>
+            </w:tcMar>
+          </w:tcPr>
+          <w:p>
+            <w:r>
+              <w:rPr>
+                <w:b/>
+                <w:color w:val="152836"/>
+                <w:sz w:val="17"/>
+              </w:rPr>
+              <w:t>Cierre / Llamado a la Acción:</w:t>
+            </w:r>
+          </w:p>
+        </w:tc>
+        <w:tc>
+          <w:tcPr>
+            <w:tcW w:type="dxa" w:w="7200"/>
+            <w:shd w:fill="FFFFFF"/>
+            <w:tcMar>
+              <w:top w:w="60" w:type="dxa"/>
+              <w:bottom w:w="60" w:type="dxa"/>
+              <w:left w:w="80" w:type="dxa"/>
+              <w:right w:w="80" w:type="dxa"/>
+            </w:tcMar>
+          </w:tcPr>
+          <w:p>
+            <w:r>
+              <w:rPr>
+                <w:color w:val="1E1E1E"/>
+                <w:sz w:val="17"/>
+              </w:rPr>
+              <w:t>Si te notificaron un traslado pericial urgente, envianos el informe por mensaje privado o contactanos desde el link de nuestro perfil para analizarlo en menos de 24 horas.</w:t>
+            </w:r>
+          </w:p>
+        </w:tc>
+      </w:tr>
+    </w:tbl>
+    <w:p/>
+    <w:tbl>
+      <w:tblPr>
+        <w:tblW w:type="auto" w:w="0"/>
+        <w:jc w:val="center"/>
+        <w:tblLook w:firstColumn="1" w:firstRow="1" w:lastColumn="0" w:lastRow="0" w:noHBand="0" w:noVBand="1" w:val="04A0"/>
+      </w:tblPr>
+      <w:tblGrid>
+        <w:gridCol w:w="5040"/>
+        <w:gridCol w:w="5040"/>
+      </w:tblGrid>
+      <w:tr>
+        <w:tc>
+          <w:tcPr>
+            <w:tcW w:type="dxa" w:w="7200"/>
+            <w:gridSpan w:val="2"/>
+            <w:shd w:fill="1A7A6C"/>
+            <w:tcMar>
+              <w:top w:w="80" w:type="dxa"/>
+              <w:bottom w:w="80" w:type="dxa"/>
+              <w:left w:w="100" w:type="dxa"/>
+              <w:right w:w="100" w:type="dxa"/>
+            </w:tcMar>
+          </w:tcPr>
+          <w:p>
+            <w:r>
+              <w:rPr>
+                <w:b/>
+                <w:color w:val="FFFFFF"/>
+                <w:sz w:val="20"/>
+              </w:rPr>
+              <w:t>🎬 GUION REEL / VIDEO: PARA PARTICULARES: DAÑO PSÍQUICO EN ACCIDENTES O DESPIDOS</w:t>
+            </w:r>
+          </w:p>
+        </w:tc>
+      </w:tr>
+      <w:tr>
+        <w:tc>
+          <w:tcPr>
+            <w:tcW w:type="dxa" w:w="2880"/>
+            <w:shd w:fill="F4F6F8"/>
+            <w:tcMar>
+              <w:top w:w="60" w:type="dxa"/>
+              <w:bottom w:w="60" w:type="dxa"/>
+              <w:left w:w="80" w:type="dxa"/>
+              <w:right w:w="80" w:type="dxa"/>
+            </w:tcMar>
+          </w:tcPr>
+          <w:p>
+            <w:r>
+              <w:rPr>
+                <w:b/>
+                <w:color w:val="152836"/>
+                <w:sz w:val="17"/>
+              </w:rPr>
+              <w:t>Público &amp; Objetivo:</w:t>
+            </w:r>
+          </w:p>
+        </w:tc>
+        <w:tc>
+          <w:tcPr>
+            <w:tcW w:type="dxa" w:w="7200"/>
+            <w:shd w:fill="FFFFFF"/>
+            <w:tcMar>
+              <w:top w:w="60" w:type="dxa"/>
+              <w:bottom w:w="60" w:type="dxa"/>
+              <w:left w:w="80" w:type="dxa"/>
+              <w:right w:w="80" w:type="dxa"/>
+            </w:tcMar>
+          </w:tcPr>
+          <w:p>
+            <w:r>
+              <w:rPr>
+                <w:color w:val="1E1E1E"/>
+                <w:sz w:val="17"/>
+              </w:rPr>
+              <w:t>Particulares que sufrieron accidentes viales o mobbing | Captar demandantes particulares y letrados patrocinantes.</w:t>
+            </w:r>
+          </w:p>
+        </w:tc>
+      </w:tr>
+      <w:tr>
+        <w:tc>
+          <w:tcPr>
+            <w:tcW w:type="dxa" w:w="2880"/>
+            <w:shd w:fill="F4F6F8"/>
+            <w:tcMar>
+              <w:top w:w="60" w:type="dxa"/>
+              <w:bottom w:w="60" w:type="dxa"/>
+              <w:left w:w="80" w:type="dxa"/>
+              <w:right w:w="80" w:type="dxa"/>
+            </w:tcMar>
+          </w:tcPr>
+          <w:p>
+            <w:r>
+              <w:rPr>
+                <w:b/>
+                <w:color w:val="152836"/>
+                <w:sz w:val="17"/>
+              </w:rPr>
+              <w:t>Gancho (Primeros 3 seg):</w:t>
+            </w:r>
+          </w:p>
+        </w:tc>
+        <w:tc>
+          <w:tcPr>
+            <w:tcW w:type="dxa" w:w="7200"/>
+            <w:shd w:fill="FFFFFF"/>
+            <w:tcMar>
+              <w:top w:w="60" w:type="dxa"/>
+              <w:bottom w:w="60" w:type="dxa"/>
+              <w:left w:w="80" w:type="dxa"/>
+              <w:right w:w="80" w:type="dxa"/>
+            </w:tcMar>
+          </w:tcPr>
+          <w:p>
+            <w:r>
+              <w:rPr>
+                <w:color w:val="1E1E1E"/>
+                <w:sz w:val="17"/>
+              </w:rPr>
+              <w:t>Tuviste un accidente de tránsito o un despido violento y sentís que después de eso tu vida no volvió a ser la misma. ¿Sabías que podés reclamar Daño Psíquico?</w:t>
+            </w:r>
+          </w:p>
+        </w:tc>
+      </w:tr>
+      <w:tr>
+        <w:tc>
+          <w:tcPr>
+            <w:tcW w:type="dxa" w:w="2880"/>
+            <w:shd w:fill="F4F6F8"/>
+            <w:tcMar>
+              <w:top w:w="60" w:type="dxa"/>
+              <w:bottom w:w="60" w:type="dxa"/>
+              <w:left w:w="80" w:type="dxa"/>
+              <w:right w:w="80" w:type="dxa"/>
+            </w:tcMar>
+          </w:tcPr>
+          <w:p>
+            <w:r>
+              <w:rPr>
+                <w:b/>
+                <w:color w:val="152836"/>
+                <w:sz w:val="17"/>
+              </w:rPr>
+              <w:t>Desarrollo (15-30 seg):</w:t>
+            </w:r>
+          </w:p>
+        </w:tc>
+        <w:tc>
+          <w:tcPr>
+            <w:tcW w:type="dxa" w:w="7200"/>
+            <w:shd w:fill="FFFFFF"/>
+            <w:tcMar>
+              <w:top w:w="60" w:type="dxa"/>
+              <w:bottom w:w="60" w:type="dxa"/>
+              <w:left w:w="80" w:type="dxa"/>
+              <w:right w:w="80" w:type="dxa"/>
+            </w:tcMar>
+          </w:tcPr>
+          <w:p>
+            <w:r>
+              <w:rPr>
+                <w:color w:val="1E1E1E"/>
+                <w:sz w:val="17"/>
+              </w:rPr>
+              <w:t>Muchas personas creen que en un juicio solo se indemnizan las lesiones físicas. Sin embargo, el estrés postraumático, los ataques de pánico o la depresión reactiva constituyen una incapacidad psicológica indemnizable según los baremos legales vigentes. A través de una evaluación psicodiagnóstica pericial de parte, medimos el porcentaje de incapacidad para que tu reclamo judicial sea justo y completo.</w:t>
+            </w:r>
+          </w:p>
+        </w:tc>
+      </w:tr>
+      <w:tr>
+        <w:tc>
+          <w:tcPr>
+            <w:tcW w:type="dxa" w:w="2880"/>
+            <w:shd w:fill="F4F6F8"/>
+            <w:tcMar>
+              <w:top w:w="60" w:type="dxa"/>
+              <w:bottom w:w="60" w:type="dxa"/>
+              <w:left w:w="80" w:type="dxa"/>
+              <w:right w:w="80" w:type="dxa"/>
+            </w:tcMar>
+          </w:tcPr>
+          <w:p>
+            <w:r>
+              <w:rPr>
+                <w:b/>
+                <w:color w:val="152836"/>
+                <w:sz w:val="17"/>
+              </w:rPr>
+              <w:t>Cierre / Llamado a la Acción:</w:t>
+            </w:r>
+          </w:p>
+        </w:tc>
+        <w:tc>
+          <w:tcPr>
+            <w:tcW w:type="dxa" w:w="7200"/>
+            <w:shd w:fill="FFFFFF"/>
+            <w:tcMar>
+              <w:top w:w="60" w:type="dxa"/>
+              <w:bottom w:w="60" w:type="dxa"/>
+              <w:left w:w="80" w:type="dxa"/>
+              <w:right w:w="80" w:type="dxa"/>
+            </w:tcMar>
+          </w:tcPr>
+          <w:p>
+            <w:r>
+              <w:rPr>
+                <w:color w:val="1E1E1E"/>
+                <w:sz w:val="17"/>
+              </w:rPr>
+              <w:t>Si estás atravesando un proceso judicial o vas a iniciar una demanda con tu abogado, escribinos al WhatsApp del perfil para coordinar una entrevista pericial.</w:t>
+            </w:r>
+          </w:p>
+        </w:tc>
+      </w:tr>
+    </w:tbl>
+    <w:p/>
+    <w:tbl>
+      <w:tblPr>
+        <w:tblW w:type="auto" w:w="0"/>
+        <w:jc w:val="center"/>
+        <w:tblLook w:firstColumn="1" w:firstRow="1" w:lastColumn="0" w:lastRow="0" w:noHBand="0" w:noVBand="1" w:val="04A0"/>
+      </w:tblPr>
+      <w:tblGrid>
+        <w:gridCol w:w="5040"/>
+        <w:gridCol w:w="5040"/>
+      </w:tblGrid>
+      <w:tr>
+        <w:tc>
+          <w:tcPr>
+            <w:tcW w:type="dxa" w:w="7200"/>
+            <w:gridSpan w:val="2"/>
+            <w:shd w:fill="1A7A6C"/>
+            <w:tcMar>
+              <w:top w:w="80" w:type="dxa"/>
+              <w:bottom w:w="80" w:type="dxa"/>
+              <w:left w:w="100" w:type="dxa"/>
+              <w:right w:w="100" w:type="dxa"/>
+            </w:tcMar>
+          </w:tcPr>
+          <w:p>
+            <w:r>
+              <w:rPr>
+                <w:b/>
+                <w:color w:val="FFFFFF"/>
+                <w:sz w:val="20"/>
+              </w:rPr>
+              <w:t>🎬 GUION REEL / VIDEO: PARA SELECCIÓN Y TRÁMITES: TEST DE BENDER Y RORSCHACH EN 48HS</w:t>
+            </w:r>
+          </w:p>
+        </w:tc>
+      </w:tr>
+      <w:tr>
+        <w:tc>
+          <w:tcPr>
+            <w:tcW w:type="dxa" w:w="2880"/>
+            <w:shd w:fill="F4F6F8"/>
+            <w:tcMar>
+              <w:top w:w="60" w:type="dxa"/>
+              <w:bottom w:w="60" w:type="dxa"/>
+              <w:left w:w="80" w:type="dxa"/>
+              <w:right w:w="80" w:type="dxa"/>
+            </w:tcMar>
+          </w:tcPr>
+          <w:p>
+            <w:r>
+              <w:rPr>
+                <w:b/>
+                <w:color w:val="152836"/>
+                <w:sz w:val="17"/>
+              </w:rPr>
+              <w:t>Público &amp; Objetivo:</w:t>
+            </w:r>
+          </w:p>
+        </w:tc>
+        <w:tc>
+          <w:tcPr>
+            <w:tcW w:type="dxa" w:w="7200"/>
+            <w:shd w:fill="FFFFFF"/>
+            <w:tcMar>
+              <w:top w:w="60" w:type="dxa"/>
+              <w:bottom w:w="60" w:type="dxa"/>
+              <w:left w:w="80" w:type="dxa"/>
+              <w:right w:w="80" w:type="dxa"/>
+            </w:tcMar>
+          </w:tcPr>
+          <w:p>
+            <w:r>
+              <w:rPr>
+                <w:color w:val="1E1E1E"/>
+                <w:sz w:val="17"/>
+              </w:rPr>
+              <w:t>Docentes, portación ANMaC, empresas de Zona Sur | Captar particulares para aptos y empresas para psicotécnicos.</w:t>
+            </w:r>
+          </w:p>
+        </w:tc>
+      </w:tr>
+      <w:tr>
+        <w:tc>
+          <w:tcPr>
+            <w:tcW w:type="dxa" w:w="2880"/>
+            <w:shd w:fill="F4F6F8"/>
+            <w:tcMar>
+              <w:top w:w="60" w:type="dxa"/>
+              <w:bottom w:w="60" w:type="dxa"/>
+              <w:left w:w="80" w:type="dxa"/>
+              <w:right w:w="80" w:type="dxa"/>
+            </w:tcMar>
+          </w:tcPr>
+          <w:p>
+            <w:r>
+              <w:rPr>
+                <w:b/>
+                <w:color w:val="152836"/>
+                <w:sz w:val="17"/>
+              </w:rPr>
+              <w:t>Gancho (Primeros 3 seg):</w:t>
+            </w:r>
+          </w:p>
+        </w:tc>
+        <w:tc>
+          <w:tcPr>
+            <w:tcW w:type="dxa" w:w="7200"/>
+            <w:shd w:fill="FFFFFF"/>
+            <w:tcMar>
+              <w:top w:w="60" w:type="dxa"/>
+              <w:bottom w:w="60" w:type="dxa"/>
+              <w:left w:w="80" w:type="dxa"/>
+              <w:right w:w="80" w:type="dxa"/>
+            </w:tcMar>
+          </w:tcPr>
+          <w:p>
+            <w:r>
+              <w:rPr>
+                <w:color w:val="1E1E1E"/>
+                <w:sz w:val="17"/>
+              </w:rPr>
+              <w:t>¿Te pidieron un Apto Psicológico urgente para ingresar a la docencia, trámite de ANMaC o un nuevo trabajo?</w:t>
+            </w:r>
+          </w:p>
+        </w:tc>
+      </w:tr>
+      <w:tr>
+        <w:tc>
+          <w:tcPr>
+            <w:tcW w:type="dxa" w:w="2880"/>
+            <w:shd w:fill="F4F6F8"/>
+            <w:tcMar>
+              <w:top w:w="60" w:type="dxa"/>
+              <w:bottom w:w="60" w:type="dxa"/>
+              <w:left w:w="80" w:type="dxa"/>
+              <w:right w:w="80" w:type="dxa"/>
+            </w:tcMar>
+          </w:tcPr>
+          <w:p>
+            <w:r>
+              <w:rPr>
+                <w:b/>
+                <w:color w:val="152836"/>
+                <w:sz w:val="17"/>
+              </w:rPr>
+              <w:t>Desarrollo (15-30 seg):</w:t>
+            </w:r>
+          </w:p>
+        </w:tc>
+        <w:tc>
+          <w:tcPr>
+            <w:tcW w:type="dxa" w:w="7200"/>
+            <w:shd w:fill="FFFFFF"/>
+            <w:tcMar>
+              <w:top w:w="60" w:type="dxa"/>
+              <w:bottom w:w="60" w:type="dxa"/>
+              <w:left w:w="80" w:type="dxa"/>
+              <w:right w:w="80" w:type="dxa"/>
+            </w:tcMar>
+          </w:tcPr>
+          <w:p>
+            <w:r>
+              <w:rPr>
+                <w:color w:val="1E1E1E"/>
+                <w:sz w:val="17"/>
+              </w:rPr>
+              <w:t>En Estudio Pericial Sur realizamos psicotécnicos y psicodiagnósticos completos administrados exclusivamente por psicólogas egresadas de la UBA. Aplicamos técnicas estandarizadas como el Test de Bender y Rorschach con entrega del informe oficial membretado y firmado en 48 horas hábiles, tanto en modalidad presencial en Zona Sur y CABA como en formato online para trámites autorizados.</w:t>
+            </w:r>
+          </w:p>
+        </w:tc>
+      </w:tr>
+      <w:tr>
+        <w:tc>
+          <w:tcPr>
+            <w:tcW w:type="dxa" w:w="2880"/>
+            <w:shd w:fill="F4F6F8"/>
+            <w:tcMar>
+              <w:top w:w="60" w:type="dxa"/>
+              <w:bottom w:w="60" w:type="dxa"/>
+              <w:left w:w="80" w:type="dxa"/>
+              <w:right w:w="80" w:type="dxa"/>
+            </w:tcMar>
+          </w:tcPr>
+          <w:p>
+            <w:r>
+              <w:rPr>
+                <w:b/>
+                <w:color w:val="152836"/>
+                <w:sz w:val="17"/>
+              </w:rPr>
+              <w:t>Cierre / Llamado a la Acción:</w:t>
+            </w:r>
+          </w:p>
+        </w:tc>
+        <w:tc>
+          <w:tcPr>
+            <w:tcW w:type="dxa" w:w="7200"/>
+            <w:shd w:fill="FFFFFF"/>
+            <w:tcMar>
+              <w:top w:w="60" w:type="dxa"/>
+              <w:bottom w:w="60" w:type="dxa"/>
+              <w:left w:w="80" w:type="dxa"/>
+              <w:right w:w="80" w:type="dxa"/>
+            </w:tcMar>
+          </w:tcPr>
+          <w:p>
+            <w:r>
+              <w:rPr>
+                <w:color w:val="1E1E1E"/>
+                <w:sz w:val="17"/>
+              </w:rPr>
+              <w:t>No dejes vencer tus plazos. Escribinos ahora mismo por mensaje directo o al WhatsApp de nuestra biografía y agendá tu turno esta semana.</w:t>
+            </w:r>
+          </w:p>
+        </w:tc>
+      </w:tr>
+    </w:tbl>
+    <w:p/>
+    <w:tbl>
+      <w:tblPr>
+        <w:tblW w:type="auto" w:w="0"/>
+        <w:jc w:val="center"/>
+        <w:tblLook w:firstColumn="1" w:firstRow="1" w:lastColumn="0" w:lastRow="0" w:noHBand="0" w:noVBand="1" w:val="04A0"/>
+      </w:tblPr>
+      <w:tblGrid>
+        <w:gridCol w:w="5040"/>
+        <w:gridCol w:w="5040"/>
+      </w:tblGrid>
+      <w:tr>
+        <w:tc>
+          <w:tcPr>
+            <w:tcW w:type="dxa" w:w="7200"/>
+            <w:gridSpan w:val="2"/>
+            <w:shd w:fill="1A7A6C"/>
+            <w:tcMar>
+              <w:top w:w="80" w:type="dxa"/>
+              <w:bottom w:w="80" w:type="dxa"/>
+              <w:left w:w="100" w:type="dxa"/>
+              <w:right w:w="100" w:type="dxa"/>
+            </w:tcMar>
+          </w:tcPr>
+          <w:p>
+            <w:r>
+              <w:rPr>
+                <w:b/>
+                <w:color w:val="FFFFFF"/>
+                <w:sz w:val="20"/>
+              </w:rPr>
+              <w:t>🎬 GUION REEL / VIDEO: PARA FAMILIA: TERAPIA Y REVINCULACIÓN POR MANDATO JUDICIAL</w:t>
+            </w:r>
+          </w:p>
+        </w:tc>
+      </w:tr>
+      <w:tr>
+        <w:tc>
+          <w:tcPr>
+            <w:tcW w:type="dxa" w:w="2880"/>
+            <w:shd w:fill="F4F6F8"/>
+            <w:tcMar>
+              <w:top w:w="60" w:type="dxa"/>
+              <w:bottom w:w="60" w:type="dxa"/>
+              <w:left w:w="80" w:type="dxa"/>
+              <w:right w:w="80" w:type="dxa"/>
+            </w:tcMar>
+          </w:tcPr>
+          <w:p>
+            <w:r>
+              <w:rPr>
+                <w:b/>
+                <w:color w:val="152836"/>
+                <w:sz w:val="17"/>
+              </w:rPr>
+              <w:t>Público &amp; Objetivo:</w:t>
+            </w:r>
+          </w:p>
+        </w:tc>
+        <w:tc>
+          <w:tcPr>
+            <w:tcW w:type="dxa" w:w="7200"/>
+            <w:shd w:fill="FFFFFF"/>
+            <w:tcMar>
+              <w:top w:w="60" w:type="dxa"/>
+              <w:bottom w:w="60" w:type="dxa"/>
+              <w:left w:w="80" w:type="dxa"/>
+              <w:right w:w="80" w:type="dxa"/>
+            </w:tcMar>
+          </w:tcPr>
+          <w:p>
+            <w:r>
+              <w:rPr>
+                <w:color w:val="1E1E1E"/>
+                <w:sz w:val="17"/>
+              </w:rPr>
+              <w:t>Padres/Madres en litigio familiar y letrados de familia | Captar familias y juzgados en procesos de divorcio y régimen de comunicación.</w:t>
+            </w:r>
+          </w:p>
+        </w:tc>
+      </w:tr>
+      <w:tr>
+        <w:tc>
+          <w:tcPr>
+            <w:tcW w:type="dxa" w:w="2880"/>
+            <w:shd w:fill="F4F6F8"/>
+            <w:tcMar>
+              <w:top w:w="60" w:type="dxa"/>
+              <w:bottom w:w="60" w:type="dxa"/>
+              <w:left w:w="80" w:type="dxa"/>
+              <w:right w:w="80" w:type="dxa"/>
+            </w:tcMar>
+          </w:tcPr>
+          <w:p>
+            <w:r>
+              <w:rPr>
+                <w:b/>
+                <w:color w:val="152836"/>
+                <w:sz w:val="17"/>
+              </w:rPr>
+              <w:t>Gancho (Primeros 3 seg):</w:t>
+            </w:r>
+          </w:p>
+        </w:tc>
+        <w:tc>
+          <w:tcPr>
+            <w:tcW w:type="dxa" w:w="7200"/>
+            <w:shd w:fill="FFFFFF"/>
+            <w:tcMar>
+              <w:top w:w="60" w:type="dxa"/>
+              <w:bottom w:w="60" w:type="dxa"/>
+              <w:left w:w="80" w:type="dxa"/>
+              <w:right w:w="80" w:type="dxa"/>
+            </w:tcMar>
+          </w:tcPr>
+          <w:p>
+            <w:r>
+              <w:rPr>
+                <w:color w:val="1E1E1E"/>
+                <w:sz w:val="17"/>
+              </w:rPr>
+              <w:t>¿El juzgado de familia te solicitó iniciar un tratamiento psicológico o un proceso de revinculación con tus hijos?</w:t>
+            </w:r>
+          </w:p>
+        </w:tc>
+      </w:tr>
+      <w:tr>
+        <w:tc>
+          <w:tcPr>
+            <w:tcW w:type="dxa" w:w="2880"/>
+            <w:shd w:fill="F4F6F8"/>
+            <w:tcMar>
+              <w:top w:w="60" w:type="dxa"/>
+              <w:bottom w:w="60" w:type="dxa"/>
+              <w:left w:w="80" w:type="dxa"/>
+              <w:right w:w="80" w:type="dxa"/>
+            </w:tcMar>
+          </w:tcPr>
+          <w:p>
+            <w:r>
+              <w:rPr>
+                <w:b/>
+                <w:color w:val="152836"/>
+                <w:sz w:val="17"/>
+              </w:rPr>
+              <w:t>Desarrollo (15-30 seg):</w:t>
+            </w:r>
+          </w:p>
+        </w:tc>
+        <w:tc>
+          <w:tcPr>
+            <w:tcW w:type="dxa" w:w="7200"/>
+            <w:shd w:fill="FFFFFF"/>
+            <w:tcMar>
+              <w:top w:w="60" w:type="dxa"/>
+              <w:bottom w:w="60" w:type="dxa"/>
+              <w:left w:w="80" w:type="dxa"/>
+              <w:right w:w="80" w:type="dxa"/>
+            </w:tcMar>
+          </w:tcPr>
+          <w:p>
+            <w:r>
+              <w:rPr>
+                <w:color w:val="1E1E1E"/>
+                <w:sz w:val="17"/>
+              </w:rPr>
+              <w:t>Los procesos judiciales en el fuero de familia requieren psicólogos que comprendan la dinámica forense y el lenguaje de los expedientes. Brindamos terapia clínica orientada a contextos judicializados, elaborando informes periódicos de evolución para presentar ante el juez, garantizando el bienestar de los niños y el cumplimiento de las medidas judiciales.</w:t>
+            </w:r>
+          </w:p>
+        </w:tc>
+      </w:tr>
+      <w:tr>
+        <w:tc>
+          <w:tcPr>
+            <w:tcW w:type="dxa" w:w="2880"/>
+            <w:shd w:fill="F4F6F8"/>
+            <w:tcMar>
+              <w:top w:w="60" w:type="dxa"/>
+              <w:bottom w:w="60" w:type="dxa"/>
+              <w:left w:w="80" w:type="dxa"/>
+              <w:right w:w="80" w:type="dxa"/>
+            </w:tcMar>
+          </w:tcPr>
+          <w:p>
+            <w:r>
+              <w:rPr>
+                <w:b/>
+                <w:color w:val="152836"/>
+                <w:sz w:val="17"/>
+              </w:rPr>
+              <w:t>Cierre / Llamado a la Acción:</w:t>
+            </w:r>
+          </w:p>
+        </w:tc>
+        <w:tc>
+          <w:tcPr>
+            <w:tcW w:type="dxa" w:w="7200"/>
+            <w:shd w:fill="FFFFFF"/>
+            <w:tcMar>
+              <w:top w:w="60" w:type="dxa"/>
+              <w:bottom w:w="60" w:type="dxa"/>
+              <w:left w:w="80" w:type="dxa"/>
+              <w:right w:w="80" w:type="dxa"/>
+            </w:tcMar>
+          </w:tcPr>
+          <w:p>
+            <w:r>
+              <w:rPr>
+                <w:color w:val="1E1E1E"/>
+                <w:sz w:val="17"/>
+              </w:rPr>
+              <w:t>Consultanos por privado para conocer cómo trabajamos y comenzar el proceso de acompañamiento.</w:t>
+            </w:r>
+          </w:p>
+        </w:tc>
+      </w:tr>
+    </w:tbl>
+    <w:p/>
+    <w:tbl>
+      <w:tblPr>
+        <w:tblW w:type="auto" w:w="0"/>
+        <w:jc w:val="center"/>
+        <w:tblLook w:firstColumn="1" w:firstRow="1" w:lastColumn="0" w:lastRow="0" w:noHBand="0" w:noVBand="1" w:val="04A0"/>
+      </w:tblPr>
+      <w:tblGrid>
+        <w:gridCol w:w="5040"/>
+        <w:gridCol w:w="5040"/>
+      </w:tblGrid>
+      <w:tr>
+        <w:tc>
+          <w:tcPr>
+            <w:tcW w:type="dxa" w:w="7200"/>
+            <w:gridSpan w:val="2"/>
+            <w:shd w:fill="1A7A6C"/>
+            <w:tcMar>
+              <w:top w:w="80" w:type="dxa"/>
+              <w:bottom w:w="80" w:type="dxa"/>
+              <w:left w:w="100" w:type="dxa"/>
+              <w:right w:w="100" w:type="dxa"/>
+            </w:tcMar>
+          </w:tcPr>
+          <w:p>
+            <w:r>
+              <w:rPr>
+                <w:b/>
+                <w:color w:val="FFFFFF"/>
+                <w:sz w:val="20"/>
+              </w:rPr>
+              <w:t>🎬 GUION REEL / VIDEO: PARA ORIENTACIÓN VOCACIONAL: REORIENTACIÓN ADULTOS Y JÓVENES</w:t>
+            </w:r>
+          </w:p>
+        </w:tc>
+      </w:tr>
+      <w:tr>
+        <w:tc>
+          <w:tcPr>
+            <w:tcW w:type="dxa" w:w="2880"/>
+            <w:shd w:fill="F4F6F8"/>
+            <w:tcMar>
+              <w:top w:w="60" w:type="dxa"/>
+              <w:bottom w:w="60" w:type="dxa"/>
+              <w:left w:w="80" w:type="dxa"/>
+              <w:right w:w="80" w:type="dxa"/>
+            </w:tcMar>
+          </w:tcPr>
+          <w:p>
+            <w:r>
+              <w:rPr>
+                <w:b/>
+                <w:color w:val="152836"/>
+                <w:sz w:val="17"/>
+              </w:rPr>
+              <w:t>Público &amp; Objetivo:</w:t>
+            </w:r>
+          </w:p>
+        </w:tc>
+        <w:tc>
+          <w:tcPr>
+            <w:tcW w:type="dxa" w:w="7200"/>
+            <w:shd w:fill="FFFFFF"/>
+            <w:tcMar>
+              <w:top w:w="60" w:type="dxa"/>
+              <w:bottom w:w="60" w:type="dxa"/>
+              <w:left w:w="80" w:type="dxa"/>
+              <w:right w:w="80" w:type="dxa"/>
+            </w:tcMar>
+          </w:tcPr>
+          <w:p>
+            <w:r>
+              <w:rPr>
+                <w:color w:val="1E1E1E"/>
+                <w:sz w:val="17"/>
+              </w:rPr>
+              <w:t>Adolescentes en secundario y adultos de 25-45 años | Captar estudiantes y adultos que buscan cambio de carrera.</w:t>
+            </w:r>
+          </w:p>
+        </w:tc>
+      </w:tr>
+      <w:tr>
+        <w:tc>
+          <w:tcPr>
+            <w:tcW w:type="dxa" w:w="2880"/>
+            <w:shd w:fill="F4F6F8"/>
+            <w:tcMar>
+              <w:top w:w="60" w:type="dxa"/>
+              <w:bottom w:w="60" w:type="dxa"/>
+              <w:left w:w="80" w:type="dxa"/>
+              <w:right w:w="80" w:type="dxa"/>
+            </w:tcMar>
+          </w:tcPr>
+          <w:p>
+            <w:r>
+              <w:rPr>
+                <w:b/>
+                <w:color w:val="152836"/>
+                <w:sz w:val="17"/>
+              </w:rPr>
+              <w:t>Gancho (Primeros 3 seg):</w:t>
+            </w:r>
+          </w:p>
+        </w:tc>
+        <w:tc>
+          <w:tcPr>
+            <w:tcW w:type="dxa" w:w="7200"/>
+            <w:shd w:fill="FFFFFF"/>
+            <w:tcMar>
+              <w:top w:w="60" w:type="dxa"/>
+              <w:bottom w:w="60" w:type="dxa"/>
+              <w:left w:w="80" w:type="dxa"/>
+              <w:right w:w="80" w:type="dxa"/>
+            </w:tcMar>
+          </w:tcPr>
+          <w:p>
+            <w:r>
+              <w:rPr>
+                <w:color w:val="1E1E1E"/>
+                <w:sz w:val="17"/>
+              </w:rPr>
+              <w:t>¿Tenés 30 o 40 años y sentís que estás atrapado en una profesión que ya no te apasiona? No estás solo.</w:t>
+            </w:r>
+          </w:p>
+        </w:tc>
+      </w:tr>
+      <w:tr>
+        <w:tc>
+          <w:tcPr>
+            <w:tcW w:type="dxa" w:w="2880"/>
+            <w:shd w:fill="F4F6F8"/>
+            <w:tcMar>
+              <w:top w:w="60" w:type="dxa"/>
+              <w:bottom w:w="60" w:type="dxa"/>
+              <w:left w:w="80" w:type="dxa"/>
+              <w:right w:w="80" w:type="dxa"/>
+            </w:tcMar>
+          </w:tcPr>
+          <w:p>
+            <w:r>
+              <w:rPr>
+                <w:b/>
+                <w:color w:val="152836"/>
+                <w:sz w:val="17"/>
+              </w:rPr>
+              <w:t>Desarrollo (15-30 seg):</w:t>
+            </w:r>
+          </w:p>
+        </w:tc>
+        <w:tc>
+          <w:tcPr>
+            <w:tcW w:type="dxa" w:w="7200"/>
+            <w:shd w:fill="FFFFFF"/>
+            <w:tcMar>
+              <w:top w:w="60" w:type="dxa"/>
+              <w:bottom w:w="60" w:type="dxa"/>
+              <w:left w:w="80" w:type="dxa"/>
+              <w:right w:w="80" w:type="dxa"/>
+            </w:tcMar>
+          </w:tcPr>
+          <w:p>
+            <w:r>
+              <w:rPr>
+                <w:color w:val="1E1E1E"/>
+                <w:sz w:val="17"/>
+              </w:rPr>
+              <w:t>La orientación vocacional no es solo para chicos que terminan el secundario. Hoy acompañamos a profesionales y trabajadores en procesos de reorientación ocupacional y reconversión laboral mediante baterías psicométricas y entrevistas en profundidad para descubrir tus verdaderos talentos y opciones del mercado actual.</w:t>
+            </w:r>
+          </w:p>
+        </w:tc>
+      </w:tr>
+      <w:tr>
+        <w:tc>
+          <w:tcPr>
+            <w:tcW w:type="dxa" w:w="2880"/>
+            <w:shd w:fill="F4F6F8"/>
+            <w:tcMar>
+              <w:top w:w="60" w:type="dxa"/>
+              <w:bottom w:w="60" w:type="dxa"/>
+              <w:left w:w="80" w:type="dxa"/>
+              <w:right w:w="80" w:type="dxa"/>
+            </w:tcMar>
+          </w:tcPr>
+          <w:p>
+            <w:r>
+              <w:rPr>
+                <w:b/>
+                <w:color w:val="152836"/>
+                <w:sz w:val="17"/>
+              </w:rPr>
+              <w:t>Cierre / Llamado a la Acción:</w:t>
+            </w:r>
+          </w:p>
+        </w:tc>
+        <w:tc>
+          <w:tcPr>
+            <w:tcW w:type="dxa" w:w="7200"/>
+            <w:shd w:fill="FFFFFF"/>
+            <w:tcMar>
+              <w:top w:w="60" w:type="dxa"/>
+              <w:bottom w:w="60" w:type="dxa"/>
+              <w:left w:w="80" w:type="dxa"/>
+              <w:right w:w="80" w:type="dxa"/>
+            </w:tcMar>
+          </w:tcPr>
+          <w:p>
+            <w:r>
+              <w:rPr>
+                <w:color w:val="1E1E1E"/>
+                <w:sz w:val="17"/>
+              </w:rPr>
+              <w:t>Da el primer paso hacia lo que te gusta. Escribinos para coordinar tu proceso de orientación vocacional online o presencial.</w:t>
+            </w:r>
+          </w:p>
+        </w:tc>
+      </w:tr>
+    </w:tbl>
+    <w:p/>
+    <w:p>
+      <w:pPr>
+        <w:spacing w:before="320" w:after="120"/>
+      </w:pPr>
+      <w:r>
+        <w:rPr>
+          <w:rFonts w:ascii="Arial" w:hAnsi="Arial"/>
+          <w:b/>
+          <w:color w:val="152836"/>
+          <w:sz w:val="26"/>
+        </w:rPr>
+        <w:t>10. Plan de Acción y Conclusión</w:t>
       </w:r>
     </w:p>
     <w:p>
@@ -5600,6 +6900,27 @@
           <w:sz w:val="19"/>
         </w:rPr>
         <w:t>Publicación de los primeros 3 artículos técnicos de alto impacto (Daño Psíquico, Impugnaciones y Aptos).</w:t>
+      </w:r>
+    </w:p>
+    <w:p>
+      <w:pPr>
+        <w:pStyle w:val="ListBullet"/>
+        <w:spacing w:after="60" w:line="276" w:lineRule="auto"/>
+      </w:pPr>
+      <w:r>
+        <w:rPr>
+          <w:b/>
+          <w:color w:val="152836"/>
+          <w:sz w:val="19"/>
+        </w:rPr>
+        <w:t xml:space="preserve">Paso 5: </w:t>
+      </w:r>
+      <w:r>
+        <w:rPr>
+          <w:color w:val="1E1E1E"/>
+          <w:sz w:val="19"/>
+        </w:rPr>
+        <w:t>Grabación y publicación del primer lote de Reels en Instagram utilizando los guiones estratégicos.</w:t>
       </w:r>
     </w:p>
     <w:sectPr>

</xml_diff>